<commit_message>
User Story Reviewer Workflow
</commit_message>
<xml_diff>
--- a/July/Week1/Day2/User Story reviewer.docx
+++ b/July/Week1/Day2/User Story reviewer.docx
@@ -124,8 +124,13 @@
           <w:numId w:val="13"/>
         </w:numPr>
       </w:pPr>
-      <w:r>
-        <w:t xml:space="preserve">Converts raw JSON into a readable user story format. </w:t>
+      <w:proofErr w:type="gramStart"/>
+      <w:r>
+        <w:t>Converts</w:t>
+      </w:r>
+      <w:proofErr w:type="gramEnd"/>
+      <w:r>
+        <w:t xml:space="preserve"> raw JSON into a readable user story format. </w:t>
       </w:r>
     </w:p>
     <w:p>
@@ -359,8 +364,13 @@
           <w:numId w:val="5"/>
         </w:numPr>
       </w:pPr>
-      <w:r>
-        <w:t xml:space="preserve">Sends the prompt to the selected LLM. </w:t>
+      <w:proofErr w:type="gramStart"/>
+      <w:r>
+        <w:t>Sends</w:t>
+      </w:r>
+      <w:proofErr w:type="gramEnd"/>
+      <w:r>
+        <w:t xml:space="preserve"> the prompt to the selected LLM. </w:t>
       </w:r>
     </w:p>
     <w:p>
@@ -744,14 +754,7 @@
           <w:b/>
           <w:bCs/>
         </w:rPr>
-        <w:t>Share</w:t>
-      </w:r>
-      <w:r>
-        <w:rPr>
-          <w:b/>
-          <w:bCs/>
-        </w:rPr>
-        <w:t>→API</w:t>
+        <w:t>Share→API</w:t>
       </w:r>
       <w:proofErr w:type="spellEnd"/>
       <w:r>
@@ -1007,6 +1010,2059 @@
         </w:drawing>
       </w:r>
     </w:p>
+    <w:p/>
+    <w:p>
+      <w:pPr>
+        <w:rPr>
+          <w:b/>
+          <w:bCs/>
+        </w:rPr>
+      </w:pPr>
+      <w:r>
+        <w:rPr>
+          <w:b/>
+          <w:bCs/>
+        </w:rPr>
+        <w:t>Postman Response:</w:t>
+      </w:r>
+    </w:p>
+    <w:p>
+      <w:r>
+        <w:t>{</w:t>
+      </w:r>
+    </w:p>
+    <w:p>
+      <w:r>
+        <w:t>    "</w:t>
+      </w:r>
+      <w:proofErr w:type="spellStart"/>
+      <w:proofErr w:type="gramStart"/>
+      <w:r>
+        <w:t>session</w:t>
+      </w:r>
+      <w:proofErr w:type="gramEnd"/>
+      <w:r>
+        <w:t>_id</w:t>
+      </w:r>
+      <w:proofErr w:type="spellEnd"/>
+      <w:r>
+        <w:t>": "YOUR_SESSION_ID_HERE",</w:t>
+      </w:r>
+    </w:p>
+    <w:p>
+      <w:r>
+        <w:t>    "outputs": [</w:t>
+      </w:r>
+    </w:p>
+    <w:p>
+      <w:r>
+        <w:t>        {</w:t>
+      </w:r>
+    </w:p>
+    <w:p>
+      <w:r>
+        <w:t>            "inputs</w:t>
+      </w:r>
+      <w:proofErr w:type="gramStart"/>
+      <w:r>
+        <w:t>": {</w:t>
+      </w:r>
+      <w:proofErr w:type="gramEnd"/>
+    </w:p>
+    <w:p>
+      <w:r>
+        <w:t>                "</w:t>
+      </w:r>
+      <w:proofErr w:type="spellStart"/>
+      <w:proofErr w:type="gramStart"/>
+      <w:r>
+        <w:t>input</w:t>
+      </w:r>
+      <w:proofErr w:type="gramEnd"/>
+      <w:r>
+        <w:t>_value</w:t>
+      </w:r>
+      <w:proofErr w:type="spellEnd"/>
+      <w:r>
+        <w:t>": "hello world!"</w:t>
+      </w:r>
+    </w:p>
+    <w:p>
+      <w:r>
+        <w:lastRenderedPageBreak/>
+        <w:t>            },</w:t>
+      </w:r>
+    </w:p>
+    <w:p>
+      <w:r>
+        <w:t>            "outputs": [</w:t>
+      </w:r>
+    </w:p>
+    <w:p>
+      <w:r>
+        <w:t>                {</w:t>
+      </w:r>
+    </w:p>
+    <w:p>
+      <w:r>
+        <w:t>                    "results</w:t>
+      </w:r>
+      <w:proofErr w:type="gramStart"/>
+      <w:r>
+        <w:t>": {</w:t>
+      </w:r>
+      <w:proofErr w:type="gramEnd"/>
+    </w:p>
+    <w:p>
+      <w:r>
+        <w:t>                        "message</w:t>
+      </w:r>
+      <w:proofErr w:type="gramStart"/>
+      <w:r>
+        <w:t>": {</w:t>
+      </w:r>
+      <w:proofErr w:type="gramEnd"/>
+    </w:p>
+    <w:p>
+      <w:r>
+        <w:t>                            "</w:t>
+      </w:r>
+      <w:proofErr w:type="spellStart"/>
+      <w:proofErr w:type="gramStart"/>
+      <w:r>
+        <w:t>text</w:t>
+      </w:r>
+      <w:proofErr w:type="gramEnd"/>
+      <w:r>
+        <w:t>_key</w:t>
+      </w:r>
+      <w:proofErr w:type="spellEnd"/>
+      <w:r>
+        <w:t>": "text",</w:t>
+      </w:r>
+    </w:p>
+    <w:p>
+      <w:r>
+        <w:t>                            "data</w:t>
+      </w:r>
+      <w:proofErr w:type="gramStart"/>
+      <w:r>
+        <w:t>": {</w:t>
+      </w:r>
+      <w:proofErr w:type="gramEnd"/>
+    </w:p>
+    <w:p>
+      <w:r>
+        <w:t>                                "timestamp": "2026-07-10 18:54:30.687107 UTC",</w:t>
+      </w:r>
+    </w:p>
+    <w:p>
+      <w:r>
+        <w:t>                                "sender": "Machine",</w:t>
+      </w:r>
+    </w:p>
+    <w:p>
+      <w:r>
+        <w:t>                                "</w:t>
+      </w:r>
+      <w:proofErr w:type="spellStart"/>
+      <w:proofErr w:type="gramStart"/>
+      <w:r>
+        <w:t>sender</w:t>
+      </w:r>
+      <w:proofErr w:type="gramEnd"/>
+      <w:r>
+        <w:t>_name</w:t>
+      </w:r>
+      <w:proofErr w:type="spellEnd"/>
+      <w:r>
+        <w:t>": "AI",</w:t>
+      </w:r>
+    </w:p>
+    <w:p>
+      <w:r>
+        <w:t>                                "</w:t>
+      </w:r>
+      <w:proofErr w:type="spellStart"/>
+      <w:proofErr w:type="gramStart"/>
+      <w:r>
+        <w:t>session</w:t>
+      </w:r>
+      <w:proofErr w:type="gramEnd"/>
+      <w:r>
+        <w:t>_id</w:t>
+      </w:r>
+      <w:proofErr w:type="spellEnd"/>
+      <w:r>
+        <w:t>": "YOUR_SESSION_ID_HERE",</w:t>
+      </w:r>
+    </w:p>
+    <w:p>
+      <w:r>
+        <w:t>                                "</w:t>
+      </w:r>
+      <w:proofErr w:type="spellStart"/>
+      <w:proofErr w:type="gramStart"/>
+      <w:r>
+        <w:t>context</w:t>
+      </w:r>
+      <w:proofErr w:type="gramEnd"/>
+      <w:r>
+        <w:t>_id</w:t>
+      </w:r>
+      <w:proofErr w:type="spellEnd"/>
+      <w:r>
+        <w:t>": "",</w:t>
+      </w:r>
+    </w:p>
+    <w:p>
+      <w:r>
+        <w:t>                                "text": "**User Story Review Summary**\n\n### User Story Title\</w:t>
+      </w:r>
+      <w:proofErr w:type="spellStart"/>
+      <w:r>
+        <w:t>nReservation</w:t>
+      </w:r>
+      <w:proofErr w:type="spellEnd"/>
+      <w:r>
+        <w:t xml:space="preserve"> notes display issue in guest detail pop over in room plan screen\n\n### Description\</w:t>
+      </w:r>
+      <w:proofErr w:type="spellStart"/>
+      <w:r>
+        <w:t>nReservation</w:t>
+      </w:r>
+      <w:proofErr w:type="spellEnd"/>
+      <w:r>
+        <w:t xml:space="preserve"> notes display issue in guest detail pop over in room plan screen\n1.click on guest in room plan screen\n2.click on notes tab in guest detail pop over\n3.click on edit option and add 3 different notes with 3 different categories\n4.Notice that reservation notes are not properly </w:t>
+      </w:r>
+      <w:proofErr w:type="spellStart"/>
+      <w:r>
+        <w:t>alligned</w:t>
+      </w:r>
+      <w:proofErr w:type="spellEnd"/>
+      <w:r>
+        <w:t xml:space="preserve"> and displayed\n\nfeature-roomplan_q323 &amp; feature-</w:t>
+      </w:r>
+      <w:proofErr w:type="spellStart"/>
+      <w:r>
+        <w:t>saltoks_integration</w:t>
+      </w:r>
+      <w:proofErr w:type="spellEnd"/>
+      <w:r>
+        <w:t xml:space="preserve">\n\n### Acceptance Criteria\n- [ ] To-Do: Add Acceptance Criteria, follow these;\n\n**Parameter Scores (out of 20)**\n\n| Parameter | Description | Score (out of 20) |\n| --- | --- | --- |\n| Clarity | The story is clear but lacks detailed acceptance criteria. | 16 |\n| Completeness | Preconditions not clearly mentioned. | 12 |\n| Business Value Alignment | Strong relevance to patient experience and operational efficiency. | 18 |\n| Testability | Can be tested through user interface automation. | 15 |\n| Technical Feasibility | Practically implementable within typical healthcare system constraints. | 17 |\n\n**Overall Quality Score (out of </w:t>
+      </w:r>
+      <w:proofErr w:type="gramStart"/>
+      <w:r>
+        <w:t>100)*</w:t>
+      </w:r>
+      <w:proofErr w:type="gramEnd"/>
+      <w:r>
+        <w:t xml:space="preserve">*: 78 / 100\n\n**Improvement </w:t>
+      </w:r>
+      <w:proofErr w:type="gramStart"/>
+      <w:r>
+        <w:t>Areas:*</w:t>
+      </w:r>
+      <w:proofErr w:type="gramEnd"/>
+      <w:r>
+        <w:t xml:space="preserve">*\n\n1.  **Add explicit acceptance criteria**: Define clear and measurable criteria for the reservation notes display issue, including expected behavior and edge cases.\n2.  **Specify preconditions**: Clearly mention the preconditions for the user story, such as the system configuration, user roles, and data requirements.\n3.  **Enhance testability**: Provide more detailed information about the user interface elements and interactions that need to be tested.\n4.  **Refine business value alignment**: Clarify how </w:t>
+      </w:r>
+      <w:r>
+        <w:lastRenderedPageBreak/>
+        <w:t>the reservation notes display issue affects patient experience, operational efficiency, or compliance.\n\n**Persona**\n\</w:t>
+      </w:r>
+      <w:proofErr w:type="spellStart"/>
+      <w:r>
+        <w:t>nAs</w:t>
+      </w:r>
+      <w:proofErr w:type="spellEnd"/>
+      <w:r>
+        <w:t xml:space="preserve"> a senior business analyst with 10+ years of experience in healthcare IT systems, I have reviewed this user story to ensure it meets the quality dimensions for clarity, completeness, business value alignment, testability, and technical feasibility.\n\n**Tone**\n\</w:t>
+      </w:r>
+      <w:proofErr w:type="spellStart"/>
+      <w:r>
+        <w:t>nThis</w:t>
+      </w:r>
+      <w:proofErr w:type="spellEnd"/>
+      <w:r>
+        <w:t xml:space="preserve"> review is professional, analytical, and constructive, providing actionable feedback to improve the user story for a healthcare project stakeholder meeting.",</w:t>
+      </w:r>
+    </w:p>
+    <w:p>
+      <w:r>
+        <w:t>                                "files": [],</w:t>
+      </w:r>
+    </w:p>
+    <w:p>
+      <w:r>
+        <w:t xml:space="preserve">                                "error": </w:t>
+      </w:r>
+      <w:r>
+        <w:rPr>
+          <w:b/>
+          <w:bCs/>
+        </w:rPr>
+        <w:t>false</w:t>
+      </w:r>
+      <w:r>
+        <w:t>,</w:t>
+      </w:r>
+    </w:p>
+    <w:p>
+      <w:r>
+        <w:t xml:space="preserve">                                "edit": </w:t>
+      </w:r>
+      <w:r>
+        <w:rPr>
+          <w:b/>
+          <w:bCs/>
+        </w:rPr>
+        <w:t>false</w:t>
+      </w:r>
+      <w:r>
+        <w:t>,</w:t>
+      </w:r>
+    </w:p>
+    <w:p>
+      <w:r>
+        <w:t>                                "properties</w:t>
+      </w:r>
+      <w:proofErr w:type="gramStart"/>
+      <w:r>
+        <w:t>": {</w:t>
+      </w:r>
+      <w:proofErr w:type="gramEnd"/>
+    </w:p>
+    <w:p>
+      <w:r>
+        <w:t>                                    "</w:t>
+      </w:r>
+      <w:proofErr w:type="spellStart"/>
+      <w:proofErr w:type="gramStart"/>
+      <w:r>
+        <w:t>text</w:t>
+      </w:r>
+      <w:proofErr w:type="gramEnd"/>
+      <w:r>
+        <w:t>_color</w:t>
+      </w:r>
+      <w:proofErr w:type="spellEnd"/>
+      <w:r>
+        <w:t xml:space="preserve">": </w:t>
+      </w:r>
+      <w:r>
+        <w:rPr>
+          <w:b/>
+          <w:bCs/>
+        </w:rPr>
+        <w:t>null</w:t>
+      </w:r>
+      <w:r>
+        <w:t>,</w:t>
+      </w:r>
+    </w:p>
+    <w:p>
+      <w:r>
+        <w:t>                                    "</w:t>
+      </w:r>
+      <w:proofErr w:type="spellStart"/>
+      <w:proofErr w:type="gramStart"/>
+      <w:r>
+        <w:t>background</w:t>
+      </w:r>
+      <w:proofErr w:type="gramEnd"/>
+      <w:r>
+        <w:t>_color</w:t>
+      </w:r>
+      <w:proofErr w:type="spellEnd"/>
+      <w:r>
+        <w:t xml:space="preserve">": </w:t>
+      </w:r>
+      <w:r>
+        <w:rPr>
+          <w:b/>
+          <w:bCs/>
+        </w:rPr>
+        <w:t>null</w:t>
+      </w:r>
+      <w:r>
+        <w:t>,</w:t>
+      </w:r>
+    </w:p>
+    <w:p>
+      <w:r>
+        <w:t xml:space="preserve">                                    "edited": </w:t>
+      </w:r>
+      <w:r>
+        <w:rPr>
+          <w:b/>
+          <w:bCs/>
+        </w:rPr>
+        <w:t>false</w:t>
+      </w:r>
+      <w:r>
+        <w:t>,</w:t>
+      </w:r>
+    </w:p>
+    <w:p>
+      <w:r>
+        <w:t>                                    "source</w:t>
+      </w:r>
+      <w:proofErr w:type="gramStart"/>
+      <w:r>
+        <w:t>": {</w:t>
+      </w:r>
+      <w:proofErr w:type="gramEnd"/>
+    </w:p>
+    <w:p>
+      <w:r>
+        <w:t>                                        "id": "</w:t>
+      </w:r>
+      <w:proofErr w:type="spellStart"/>
+      <w:r>
+        <w:t>GroqModel-brDGD</w:t>
+      </w:r>
+      <w:proofErr w:type="spellEnd"/>
+      <w:r>
+        <w:t>",</w:t>
+      </w:r>
+    </w:p>
+    <w:p>
+      <w:r>
+        <w:t>                                        "</w:t>
+      </w:r>
+      <w:proofErr w:type="spellStart"/>
+      <w:proofErr w:type="gramStart"/>
+      <w:r>
+        <w:t>display</w:t>
+      </w:r>
+      <w:proofErr w:type="gramEnd"/>
+      <w:r>
+        <w:t>_name</w:t>
+      </w:r>
+      <w:proofErr w:type="spellEnd"/>
+      <w:r>
+        <w:t>": "</w:t>
+      </w:r>
+      <w:proofErr w:type="spellStart"/>
+      <w:r>
+        <w:t>Groq</w:t>
+      </w:r>
+      <w:proofErr w:type="spellEnd"/>
+      <w:r>
+        <w:t>",</w:t>
+      </w:r>
+    </w:p>
+    <w:p>
+      <w:r>
+        <w:t>                                        "source": "llama-3.1-8b-instant"</w:t>
+      </w:r>
+    </w:p>
+    <w:p>
+      <w:r>
+        <w:t>                                    },</w:t>
+      </w:r>
+    </w:p>
+    <w:p>
+      <w:r>
+        <w:t xml:space="preserve">                                    "icon": </w:t>
+      </w:r>
+      <w:r>
+        <w:rPr>
+          <w:b/>
+          <w:bCs/>
+        </w:rPr>
+        <w:t>null</w:t>
+      </w:r>
+      <w:r>
+        <w:t>,</w:t>
+      </w:r>
+    </w:p>
+    <w:p>
+      <w:r>
+        <w:t>                                    "</w:t>
+      </w:r>
+      <w:proofErr w:type="spellStart"/>
+      <w:proofErr w:type="gramStart"/>
+      <w:r>
+        <w:t>allow</w:t>
+      </w:r>
+      <w:proofErr w:type="gramEnd"/>
+      <w:r>
+        <w:t>_markdown</w:t>
+      </w:r>
+      <w:proofErr w:type="spellEnd"/>
+      <w:r>
+        <w:t xml:space="preserve">": </w:t>
+      </w:r>
+      <w:r>
+        <w:rPr>
+          <w:b/>
+          <w:bCs/>
+        </w:rPr>
+        <w:t>false</w:t>
+      </w:r>
+      <w:r>
+        <w:t>,</w:t>
+      </w:r>
+    </w:p>
+    <w:p>
+      <w:r>
+        <w:t>                                    "</w:t>
+      </w:r>
+      <w:proofErr w:type="spellStart"/>
+      <w:proofErr w:type="gramStart"/>
+      <w:r>
+        <w:t>positive</w:t>
+      </w:r>
+      <w:proofErr w:type="gramEnd"/>
+      <w:r>
+        <w:t>_feedback</w:t>
+      </w:r>
+      <w:proofErr w:type="spellEnd"/>
+      <w:r>
+        <w:t xml:space="preserve">": </w:t>
+      </w:r>
+      <w:r>
+        <w:rPr>
+          <w:b/>
+          <w:bCs/>
+        </w:rPr>
+        <w:t>null</w:t>
+      </w:r>
+      <w:r>
+        <w:t>,</w:t>
+      </w:r>
+    </w:p>
+    <w:p>
+      <w:r>
+        <w:t>                                    "state": "complete",</w:t>
+      </w:r>
+    </w:p>
+    <w:p>
+      <w:r>
+        <w:t>                                    "targets": [],</w:t>
+      </w:r>
+    </w:p>
+    <w:p>
+      <w:r>
+        <w:t>                                    "usage</w:t>
+      </w:r>
+      <w:proofErr w:type="gramStart"/>
+      <w:r>
+        <w:t>": {</w:t>
+      </w:r>
+      <w:proofErr w:type="gramEnd"/>
+    </w:p>
+    <w:p>
+      <w:r>
+        <w:t>                                        "</w:t>
+      </w:r>
+      <w:proofErr w:type="spellStart"/>
+      <w:proofErr w:type="gramStart"/>
+      <w:r>
+        <w:t>input</w:t>
+      </w:r>
+      <w:proofErr w:type="gramEnd"/>
+      <w:r>
+        <w:t>_tokens</w:t>
+      </w:r>
+      <w:proofErr w:type="spellEnd"/>
+      <w:r>
+        <w:t>": 21115,</w:t>
+      </w:r>
+    </w:p>
+    <w:p>
+      <w:r>
+        <w:t>                                        "</w:t>
+      </w:r>
+      <w:proofErr w:type="spellStart"/>
+      <w:proofErr w:type="gramStart"/>
+      <w:r>
+        <w:t>output</w:t>
+      </w:r>
+      <w:proofErr w:type="gramEnd"/>
+      <w:r>
+        <w:t>_tokens</w:t>
+      </w:r>
+      <w:proofErr w:type="spellEnd"/>
+      <w:r>
+        <w:t>": 583,</w:t>
+      </w:r>
+    </w:p>
+    <w:p>
+      <w:r>
+        <w:t>                                        "</w:t>
+      </w:r>
+      <w:proofErr w:type="spellStart"/>
+      <w:proofErr w:type="gramStart"/>
+      <w:r>
+        <w:t>total</w:t>
+      </w:r>
+      <w:proofErr w:type="gramEnd"/>
+      <w:r>
+        <w:t>_tokens</w:t>
+      </w:r>
+      <w:proofErr w:type="spellEnd"/>
+      <w:r>
+        <w:t>": 21698</w:t>
+      </w:r>
+    </w:p>
+    <w:p>
+      <w:r>
+        <w:lastRenderedPageBreak/>
+        <w:t>                                    },</w:t>
+      </w:r>
+    </w:p>
+    <w:p>
+      <w:r>
+        <w:t>                                    "</w:t>
+      </w:r>
+      <w:proofErr w:type="spellStart"/>
+      <w:proofErr w:type="gramStart"/>
+      <w:r>
+        <w:t>build</w:t>
+      </w:r>
+      <w:proofErr w:type="gramEnd"/>
+      <w:r>
+        <w:t>_duration</w:t>
+      </w:r>
+      <w:proofErr w:type="spellEnd"/>
+      <w:r>
+        <w:t xml:space="preserve">": </w:t>
+      </w:r>
+      <w:r>
+        <w:rPr>
+          <w:b/>
+          <w:bCs/>
+        </w:rPr>
+        <w:t>null</w:t>
+      </w:r>
+    </w:p>
+    <w:p>
+      <w:r>
+        <w:t>                                },</w:t>
+      </w:r>
+    </w:p>
+    <w:p>
+      <w:r>
+        <w:t>                                "category": "message",</w:t>
+      </w:r>
+    </w:p>
+    <w:p>
+      <w:r>
+        <w:t>                                "</w:t>
+      </w:r>
+      <w:proofErr w:type="spellStart"/>
+      <w:proofErr w:type="gramStart"/>
+      <w:r>
+        <w:t>content</w:t>
+      </w:r>
+      <w:proofErr w:type="gramEnd"/>
+      <w:r>
+        <w:t>_blocks</w:t>
+      </w:r>
+      <w:proofErr w:type="spellEnd"/>
+      <w:r>
+        <w:t>": [],</w:t>
+      </w:r>
+    </w:p>
+    <w:p>
+      <w:r>
+        <w:t>                                "</w:t>
+      </w:r>
+      <w:proofErr w:type="spellStart"/>
+      <w:proofErr w:type="gramStart"/>
+      <w:r>
+        <w:t>session</w:t>
+      </w:r>
+      <w:proofErr w:type="gramEnd"/>
+      <w:r>
+        <w:t>_metadata</w:t>
+      </w:r>
+      <w:proofErr w:type="spellEnd"/>
+      <w:proofErr w:type="gramStart"/>
+      <w:r>
+        <w:t>": {</w:t>
+      </w:r>
+      <w:proofErr w:type="gramEnd"/>
+    </w:p>
+    <w:p>
+      <w:r>
+        <w:t>                                    "</w:t>
+      </w:r>
+      <w:proofErr w:type="spellStart"/>
+      <w:proofErr w:type="gramStart"/>
+      <w:r>
+        <w:t>graph</w:t>
+      </w:r>
+      <w:proofErr w:type="gramEnd"/>
+      <w:r>
+        <w:t>_run_id</w:t>
+      </w:r>
+      <w:proofErr w:type="spellEnd"/>
+      <w:r>
+        <w:t>": "b86294f3-991b-4b1f-9a73-91694f295253"</w:t>
+      </w:r>
+    </w:p>
+    <w:p>
+      <w:r>
+        <w:t>                                },</w:t>
+      </w:r>
+    </w:p>
+    <w:p>
+      <w:r>
+        <w:t>                                "id": "62ed66f4-77ef-4d4c-ad29-c224d066b32b",</w:t>
+      </w:r>
+    </w:p>
+    <w:p>
+      <w:r>
+        <w:t>                                "</w:t>
+      </w:r>
+      <w:proofErr w:type="spellStart"/>
+      <w:proofErr w:type="gramStart"/>
+      <w:r>
+        <w:t>flow</w:t>
+      </w:r>
+      <w:proofErr w:type="gramEnd"/>
+      <w:r>
+        <w:t>_id</w:t>
+      </w:r>
+      <w:proofErr w:type="spellEnd"/>
+      <w:r>
+        <w:t>": "4c597cc8-2bf2-48b7-92a8-8fd3d4d3c99a",</w:t>
+      </w:r>
+    </w:p>
+    <w:p>
+      <w:r>
+        <w:t>                                "</w:t>
+      </w:r>
+      <w:proofErr w:type="spellStart"/>
+      <w:proofErr w:type="gramStart"/>
+      <w:r>
+        <w:t>run</w:t>
+      </w:r>
+      <w:proofErr w:type="gramEnd"/>
+      <w:r>
+        <w:t>_id</w:t>
+      </w:r>
+      <w:proofErr w:type="spellEnd"/>
+      <w:r>
+        <w:t>": "b86294f3-991b-4b1f-9a73-91694f295253",</w:t>
+      </w:r>
+    </w:p>
+    <w:p>
+      <w:r>
+        <w:t xml:space="preserve">                                "duration": </w:t>
+      </w:r>
+      <w:r>
+        <w:rPr>
+          <w:b/>
+          <w:bCs/>
+        </w:rPr>
+        <w:t>null</w:t>
+      </w:r>
+    </w:p>
+    <w:p>
+      <w:r>
+        <w:t>                            },</w:t>
+      </w:r>
+    </w:p>
+    <w:p>
+      <w:r>
+        <w:t>                            "</w:t>
+      </w:r>
+      <w:proofErr w:type="spellStart"/>
+      <w:proofErr w:type="gramStart"/>
+      <w:r>
+        <w:t>default</w:t>
+      </w:r>
+      <w:proofErr w:type="gramEnd"/>
+      <w:r>
+        <w:t>_value</w:t>
+      </w:r>
+      <w:proofErr w:type="spellEnd"/>
+      <w:r>
+        <w:t>": "",</w:t>
+      </w:r>
+    </w:p>
+    <w:p>
+      <w:r>
+        <w:t>                            "text": "**User Story Review Summary**\n\n### User Story Title\</w:t>
+      </w:r>
+      <w:proofErr w:type="spellStart"/>
+      <w:r>
+        <w:t>nReservation</w:t>
+      </w:r>
+      <w:proofErr w:type="spellEnd"/>
+      <w:r>
+        <w:t xml:space="preserve"> notes display issue in guest detail pop over in room plan screen\n\n### Description\</w:t>
+      </w:r>
+      <w:proofErr w:type="spellStart"/>
+      <w:r>
+        <w:t>nReservation</w:t>
+      </w:r>
+      <w:proofErr w:type="spellEnd"/>
+      <w:r>
+        <w:t xml:space="preserve"> notes display issue in guest detail pop over in room plan screen\n1.click on guest in room plan screen\n2.click on notes tab in guest detail pop over\n3.click on edit option and add 3 different notes with 3 different categories\n4.Notice that reservation notes are not properly </w:t>
+      </w:r>
+      <w:proofErr w:type="spellStart"/>
+      <w:r>
+        <w:t>alligned</w:t>
+      </w:r>
+      <w:proofErr w:type="spellEnd"/>
+      <w:r>
+        <w:t xml:space="preserve"> and displayed\n\nfeature-roomplan_q323 &amp; feature-</w:t>
+      </w:r>
+      <w:proofErr w:type="spellStart"/>
+      <w:r>
+        <w:t>saltoks_integration</w:t>
+      </w:r>
+      <w:proofErr w:type="spellEnd"/>
+      <w:r>
+        <w:t xml:space="preserve">\n\n### Acceptance Criteria\n- [ ] To-Do: Add Acceptance Criteria, follow these;\n\n**Parameter Scores (out of 20)**\n\n| Parameter | Description | Score (out of 20) |\n| --- | --- | --- |\n| Clarity | The story is clear but lacks detailed acceptance criteria. | 16 |\n| Completeness | Preconditions not clearly mentioned. | 12 |\n| Business Value Alignment | Strong relevance to patient experience and operational efficiency. | 18 |\n| Testability | Can be tested through user interface automation. | 15 |\n| Technical Feasibility | Practically implementable within typical healthcare system constraints. | 17 |\n\n**Overall Quality Score (out of </w:t>
+      </w:r>
+      <w:proofErr w:type="gramStart"/>
+      <w:r>
+        <w:t>100)*</w:t>
+      </w:r>
+      <w:proofErr w:type="gramEnd"/>
+      <w:r>
+        <w:t xml:space="preserve">*: 78 / 100\n\n**Improvement </w:t>
+      </w:r>
+      <w:proofErr w:type="gramStart"/>
+      <w:r>
+        <w:t>Areas:*</w:t>
+      </w:r>
+      <w:proofErr w:type="gramEnd"/>
+      <w:r>
+        <w:t xml:space="preserve">*\n\n1.  **Add explicit acceptance criteria**: Define clear and measurable criteria for the reservation notes display issue, including expected behavior and edge cases.\n2.  **Specify preconditions**: Clearly mention the preconditions for the user story, </w:t>
+      </w:r>
+      <w:r>
+        <w:lastRenderedPageBreak/>
+        <w:t>such as the system configuration, user roles, and data requirements.\n3.  **Enhance testability**: Provide more detailed information about the user interface elements and interactions that need to be tested.\n4.  **Refine business value alignment**: Clarify how the reservation notes display issue affects patient experience, operational efficiency, or compliance.\n\n**Persona**\n\</w:t>
+      </w:r>
+      <w:proofErr w:type="spellStart"/>
+      <w:r>
+        <w:t>nAs</w:t>
+      </w:r>
+      <w:proofErr w:type="spellEnd"/>
+      <w:r>
+        <w:t xml:space="preserve"> a senior business analyst with 10+ years of experience in healthcare IT systems, I have reviewed this user story to ensure it meets the quality dimensions for clarity, completeness, business value alignment, testability, and technical feasibility.\n\n**Tone**\n\</w:t>
+      </w:r>
+      <w:proofErr w:type="spellStart"/>
+      <w:r>
+        <w:t>nThis</w:t>
+      </w:r>
+      <w:proofErr w:type="spellEnd"/>
+      <w:r>
+        <w:t xml:space="preserve"> review is professional, analytical, and constructive, providing actionable feedback to improve the user story for a healthcare project stakeholder meeting.",</w:t>
+      </w:r>
+    </w:p>
+    <w:p>
+      <w:r>
+        <w:t>                            "sender": "Machine",</w:t>
+      </w:r>
+    </w:p>
+    <w:p>
+      <w:r>
+        <w:t>                            "</w:t>
+      </w:r>
+      <w:proofErr w:type="spellStart"/>
+      <w:proofErr w:type="gramStart"/>
+      <w:r>
+        <w:t>sender</w:t>
+      </w:r>
+      <w:proofErr w:type="gramEnd"/>
+      <w:r>
+        <w:t>_name</w:t>
+      </w:r>
+      <w:proofErr w:type="spellEnd"/>
+      <w:r>
+        <w:t>": "AI",</w:t>
+      </w:r>
+    </w:p>
+    <w:p>
+      <w:r>
+        <w:t>                            "files": [],</w:t>
+      </w:r>
+    </w:p>
+    <w:p>
+      <w:r>
+        <w:t>                            "</w:t>
+      </w:r>
+      <w:proofErr w:type="spellStart"/>
+      <w:proofErr w:type="gramStart"/>
+      <w:r>
+        <w:t>session</w:t>
+      </w:r>
+      <w:proofErr w:type="gramEnd"/>
+      <w:r>
+        <w:t>_id</w:t>
+      </w:r>
+      <w:proofErr w:type="spellEnd"/>
+      <w:r>
+        <w:t>": "YOUR_SESSION_ID_HERE",</w:t>
+      </w:r>
+    </w:p>
+    <w:p>
+      <w:r>
+        <w:t>                            "</w:t>
+      </w:r>
+      <w:proofErr w:type="spellStart"/>
+      <w:proofErr w:type="gramStart"/>
+      <w:r>
+        <w:t>context</w:t>
+      </w:r>
+      <w:proofErr w:type="gramEnd"/>
+      <w:r>
+        <w:t>_id</w:t>
+      </w:r>
+      <w:proofErr w:type="spellEnd"/>
+      <w:r>
+        <w:t>": "",</w:t>
+      </w:r>
+    </w:p>
+    <w:p>
+      <w:r>
+        <w:t>                            "</w:t>
+      </w:r>
+      <w:proofErr w:type="spellStart"/>
+      <w:proofErr w:type="gramStart"/>
+      <w:r>
+        <w:t>run</w:t>
+      </w:r>
+      <w:proofErr w:type="gramEnd"/>
+      <w:r>
+        <w:t>_id</w:t>
+      </w:r>
+      <w:proofErr w:type="spellEnd"/>
+      <w:r>
+        <w:t>": "b86294f3-991b-4b1f-9a73-91694f295253",</w:t>
+      </w:r>
+    </w:p>
+    <w:p>
+      <w:r>
+        <w:t>                            "timestamp": "2026-07-10 18:54:30.687107 UTC",</w:t>
+      </w:r>
+    </w:p>
+    <w:p>
+      <w:r>
+        <w:t>                            "</w:t>
+      </w:r>
+      <w:proofErr w:type="spellStart"/>
+      <w:proofErr w:type="gramStart"/>
+      <w:r>
+        <w:t>flow</w:t>
+      </w:r>
+      <w:proofErr w:type="gramEnd"/>
+      <w:r>
+        <w:t>_id</w:t>
+      </w:r>
+      <w:proofErr w:type="spellEnd"/>
+      <w:r>
+        <w:t>": "4c597cc8-2bf2-48b7-92a8-8fd3d4d3c99a",</w:t>
+      </w:r>
+    </w:p>
+    <w:p>
+      <w:r>
+        <w:t xml:space="preserve">                            "error": </w:t>
+      </w:r>
+      <w:r>
+        <w:rPr>
+          <w:b/>
+          <w:bCs/>
+        </w:rPr>
+        <w:t>false</w:t>
+      </w:r>
+      <w:r>
+        <w:t>,</w:t>
+      </w:r>
+    </w:p>
+    <w:p>
+      <w:r>
+        <w:t xml:space="preserve">                            "edit": </w:t>
+      </w:r>
+      <w:r>
+        <w:rPr>
+          <w:b/>
+          <w:bCs/>
+        </w:rPr>
+        <w:t>false</w:t>
+      </w:r>
+      <w:r>
+        <w:t>,</w:t>
+      </w:r>
+    </w:p>
+    <w:p>
+      <w:r>
+        <w:t>                            "properties</w:t>
+      </w:r>
+      <w:proofErr w:type="gramStart"/>
+      <w:r>
+        <w:t>": {</w:t>
+      </w:r>
+      <w:proofErr w:type="gramEnd"/>
+    </w:p>
+    <w:p>
+      <w:r>
+        <w:t>                                "</w:t>
+      </w:r>
+      <w:proofErr w:type="spellStart"/>
+      <w:proofErr w:type="gramStart"/>
+      <w:r>
+        <w:t>text</w:t>
+      </w:r>
+      <w:proofErr w:type="gramEnd"/>
+      <w:r>
+        <w:t>_color</w:t>
+      </w:r>
+      <w:proofErr w:type="spellEnd"/>
+      <w:r>
+        <w:t xml:space="preserve">": </w:t>
+      </w:r>
+      <w:r>
+        <w:rPr>
+          <w:b/>
+          <w:bCs/>
+        </w:rPr>
+        <w:t>null</w:t>
+      </w:r>
+      <w:r>
+        <w:t>,</w:t>
+      </w:r>
+    </w:p>
+    <w:p>
+      <w:r>
+        <w:t>                                "</w:t>
+      </w:r>
+      <w:proofErr w:type="spellStart"/>
+      <w:proofErr w:type="gramStart"/>
+      <w:r>
+        <w:t>background</w:t>
+      </w:r>
+      <w:proofErr w:type="gramEnd"/>
+      <w:r>
+        <w:t>_color</w:t>
+      </w:r>
+      <w:proofErr w:type="spellEnd"/>
+      <w:r>
+        <w:t xml:space="preserve">": </w:t>
+      </w:r>
+      <w:r>
+        <w:rPr>
+          <w:b/>
+          <w:bCs/>
+        </w:rPr>
+        <w:t>null</w:t>
+      </w:r>
+      <w:r>
+        <w:t>,</w:t>
+      </w:r>
+    </w:p>
+    <w:p>
+      <w:r>
+        <w:t xml:space="preserve">                                "edited": </w:t>
+      </w:r>
+      <w:r>
+        <w:rPr>
+          <w:b/>
+          <w:bCs/>
+        </w:rPr>
+        <w:t>false</w:t>
+      </w:r>
+      <w:r>
+        <w:t>,</w:t>
+      </w:r>
+    </w:p>
+    <w:p>
+      <w:r>
+        <w:t>                                "source</w:t>
+      </w:r>
+      <w:proofErr w:type="gramStart"/>
+      <w:r>
+        <w:t>": {</w:t>
+      </w:r>
+      <w:proofErr w:type="gramEnd"/>
+    </w:p>
+    <w:p>
+      <w:r>
+        <w:t>                                    "id": "</w:t>
+      </w:r>
+      <w:proofErr w:type="spellStart"/>
+      <w:r>
+        <w:t>GroqModel-brDGD</w:t>
+      </w:r>
+      <w:proofErr w:type="spellEnd"/>
+      <w:r>
+        <w:t>",</w:t>
+      </w:r>
+    </w:p>
+    <w:p>
+      <w:r>
+        <w:t>                                    "</w:t>
+      </w:r>
+      <w:proofErr w:type="spellStart"/>
+      <w:proofErr w:type="gramStart"/>
+      <w:r>
+        <w:t>display</w:t>
+      </w:r>
+      <w:proofErr w:type="gramEnd"/>
+      <w:r>
+        <w:t>_name</w:t>
+      </w:r>
+      <w:proofErr w:type="spellEnd"/>
+      <w:r>
+        <w:t>": "</w:t>
+      </w:r>
+      <w:proofErr w:type="spellStart"/>
+      <w:r>
+        <w:t>Groq</w:t>
+      </w:r>
+      <w:proofErr w:type="spellEnd"/>
+      <w:r>
+        <w:t>",</w:t>
+      </w:r>
+    </w:p>
+    <w:p>
+      <w:r>
+        <w:t>                                    "source": "llama-3.1-8b-instant"</w:t>
+      </w:r>
+    </w:p>
+    <w:p>
+      <w:r>
+        <w:t>                                },</w:t>
+      </w:r>
+    </w:p>
+    <w:p>
+      <w:r>
+        <w:lastRenderedPageBreak/>
+        <w:t xml:space="preserve">                                "icon": </w:t>
+      </w:r>
+      <w:r>
+        <w:rPr>
+          <w:b/>
+          <w:bCs/>
+        </w:rPr>
+        <w:t>null</w:t>
+      </w:r>
+      <w:r>
+        <w:t>,</w:t>
+      </w:r>
+    </w:p>
+    <w:p>
+      <w:r>
+        <w:t>                                "</w:t>
+      </w:r>
+      <w:proofErr w:type="spellStart"/>
+      <w:proofErr w:type="gramStart"/>
+      <w:r>
+        <w:t>allow</w:t>
+      </w:r>
+      <w:proofErr w:type="gramEnd"/>
+      <w:r>
+        <w:t>_markdown</w:t>
+      </w:r>
+      <w:proofErr w:type="spellEnd"/>
+      <w:r>
+        <w:t xml:space="preserve">": </w:t>
+      </w:r>
+      <w:r>
+        <w:rPr>
+          <w:b/>
+          <w:bCs/>
+        </w:rPr>
+        <w:t>false</w:t>
+      </w:r>
+      <w:r>
+        <w:t>,</w:t>
+      </w:r>
+    </w:p>
+    <w:p>
+      <w:r>
+        <w:t>                                "</w:t>
+      </w:r>
+      <w:proofErr w:type="spellStart"/>
+      <w:proofErr w:type="gramStart"/>
+      <w:r>
+        <w:t>positive</w:t>
+      </w:r>
+      <w:proofErr w:type="gramEnd"/>
+      <w:r>
+        <w:t>_feedback</w:t>
+      </w:r>
+      <w:proofErr w:type="spellEnd"/>
+      <w:r>
+        <w:t xml:space="preserve">": </w:t>
+      </w:r>
+      <w:r>
+        <w:rPr>
+          <w:b/>
+          <w:bCs/>
+        </w:rPr>
+        <w:t>null</w:t>
+      </w:r>
+      <w:r>
+        <w:t>,</w:t>
+      </w:r>
+    </w:p>
+    <w:p>
+      <w:r>
+        <w:t>                                "state": "complete",</w:t>
+      </w:r>
+    </w:p>
+    <w:p>
+      <w:r>
+        <w:t>                                "targets": [],</w:t>
+      </w:r>
+    </w:p>
+    <w:p>
+      <w:r>
+        <w:t>                                "usage</w:t>
+      </w:r>
+      <w:proofErr w:type="gramStart"/>
+      <w:r>
+        <w:t>": {</w:t>
+      </w:r>
+      <w:proofErr w:type="gramEnd"/>
+    </w:p>
+    <w:p>
+      <w:r>
+        <w:t>                                    "</w:t>
+      </w:r>
+      <w:proofErr w:type="spellStart"/>
+      <w:proofErr w:type="gramStart"/>
+      <w:r>
+        <w:t>input</w:t>
+      </w:r>
+      <w:proofErr w:type="gramEnd"/>
+      <w:r>
+        <w:t>_tokens</w:t>
+      </w:r>
+      <w:proofErr w:type="spellEnd"/>
+      <w:r>
+        <w:t>": 21115,</w:t>
+      </w:r>
+    </w:p>
+    <w:p>
+      <w:r>
+        <w:t>                                    "</w:t>
+      </w:r>
+      <w:proofErr w:type="spellStart"/>
+      <w:proofErr w:type="gramStart"/>
+      <w:r>
+        <w:t>output</w:t>
+      </w:r>
+      <w:proofErr w:type="gramEnd"/>
+      <w:r>
+        <w:t>_tokens</w:t>
+      </w:r>
+      <w:proofErr w:type="spellEnd"/>
+      <w:r>
+        <w:t>": 583,</w:t>
+      </w:r>
+    </w:p>
+    <w:p>
+      <w:r>
+        <w:t>                                    "</w:t>
+      </w:r>
+      <w:proofErr w:type="spellStart"/>
+      <w:proofErr w:type="gramStart"/>
+      <w:r>
+        <w:t>total</w:t>
+      </w:r>
+      <w:proofErr w:type="gramEnd"/>
+      <w:r>
+        <w:t>_tokens</w:t>
+      </w:r>
+      <w:proofErr w:type="spellEnd"/>
+      <w:r>
+        <w:t>": 21698</w:t>
+      </w:r>
+    </w:p>
+    <w:p>
+      <w:r>
+        <w:t>                                },</w:t>
+      </w:r>
+    </w:p>
+    <w:p>
+      <w:r>
+        <w:t>                                "</w:t>
+      </w:r>
+      <w:proofErr w:type="spellStart"/>
+      <w:proofErr w:type="gramStart"/>
+      <w:r>
+        <w:t>build</w:t>
+      </w:r>
+      <w:proofErr w:type="gramEnd"/>
+      <w:r>
+        <w:t>_duration</w:t>
+      </w:r>
+      <w:proofErr w:type="spellEnd"/>
+      <w:r>
+        <w:t xml:space="preserve">": </w:t>
+      </w:r>
+      <w:r>
+        <w:rPr>
+          <w:b/>
+          <w:bCs/>
+        </w:rPr>
+        <w:t>null</w:t>
+      </w:r>
+    </w:p>
+    <w:p>
+      <w:r>
+        <w:t>                            },</w:t>
+      </w:r>
+    </w:p>
+    <w:p>
+      <w:r>
+        <w:t>                            "category": "message",</w:t>
+      </w:r>
+    </w:p>
+    <w:p>
+      <w:r>
+        <w:t>                            "</w:t>
+      </w:r>
+      <w:proofErr w:type="spellStart"/>
+      <w:proofErr w:type="gramStart"/>
+      <w:r>
+        <w:t>content</w:t>
+      </w:r>
+      <w:proofErr w:type="gramEnd"/>
+      <w:r>
+        <w:t>_blocks</w:t>
+      </w:r>
+      <w:proofErr w:type="spellEnd"/>
+      <w:r>
+        <w:t>": [],</w:t>
+      </w:r>
+    </w:p>
+    <w:p>
+      <w:r>
+        <w:t xml:space="preserve">                            "duration": </w:t>
+      </w:r>
+      <w:r>
+        <w:rPr>
+          <w:b/>
+          <w:bCs/>
+        </w:rPr>
+        <w:t>null</w:t>
+      </w:r>
+      <w:r>
+        <w:t>,</w:t>
+      </w:r>
+    </w:p>
+    <w:p>
+      <w:r>
+        <w:t>                            "</w:t>
+      </w:r>
+      <w:proofErr w:type="spellStart"/>
+      <w:proofErr w:type="gramStart"/>
+      <w:r>
+        <w:t>session</w:t>
+      </w:r>
+      <w:proofErr w:type="gramEnd"/>
+      <w:r>
+        <w:t>_metadata</w:t>
+      </w:r>
+      <w:proofErr w:type="spellEnd"/>
+      <w:proofErr w:type="gramStart"/>
+      <w:r>
+        <w:t>": {</w:t>
+      </w:r>
+      <w:proofErr w:type="gramEnd"/>
+    </w:p>
+    <w:p>
+      <w:r>
+        <w:t>                                "</w:t>
+      </w:r>
+      <w:proofErr w:type="spellStart"/>
+      <w:proofErr w:type="gramStart"/>
+      <w:r>
+        <w:t>graph</w:t>
+      </w:r>
+      <w:proofErr w:type="gramEnd"/>
+      <w:r>
+        <w:t>_run_id</w:t>
+      </w:r>
+      <w:proofErr w:type="spellEnd"/>
+      <w:r>
+        <w:t>": "b86294f3-991b-4b1f-9a73-91694f295253"</w:t>
+      </w:r>
+    </w:p>
+    <w:p>
+      <w:r>
+        <w:t>                            }</w:t>
+      </w:r>
+    </w:p>
+    <w:p>
+      <w:r>
+        <w:t>                        }</w:t>
+      </w:r>
+    </w:p>
+    <w:p>
+      <w:r>
+        <w:t>                    },</w:t>
+      </w:r>
+    </w:p>
+    <w:p>
+      <w:r>
+        <w:t>                    "artifacts</w:t>
+      </w:r>
+      <w:proofErr w:type="gramStart"/>
+      <w:r>
+        <w:t>": {</w:t>
+      </w:r>
+      <w:proofErr w:type="gramEnd"/>
+    </w:p>
+    <w:p>
+      <w:r>
+        <w:t>                        "message": "**User Story Review Summary**\n\n### User Story Title\n\</w:t>
+      </w:r>
+      <w:proofErr w:type="spellStart"/>
+      <w:r>
+        <w:t>nReservation</w:t>
+      </w:r>
+      <w:proofErr w:type="spellEnd"/>
+      <w:r>
+        <w:t xml:space="preserve"> notes display issue in guest detail pop over in room plan screen\n\n### Description\n\</w:t>
+      </w:r>
+      <w:proofErr w:type="spellStart"/>
+      <w:r>
+        <w:t>nReservation</w:t>
+      </w:r>
+      <w:proofErr w:type="spellEnd"/>
+      <w:r>
+        <w:t xml:space="preserve"> notes display issue in guest detail pop over in room plan screen\n\n1.click on guest in room plan screen\n\n2.click on notes tab in guest detail pop over\n\n3.click on edit option and add 3 different notes with 3 different categories\n\n4.Notice that reservation notes are not properly </w:t>
+      </w:r>
+      <w:proofErr w:type="spellStart"/>
+      <w:r>
+        <w:t>alligned</w:t>
+      </w:r>
+      <w:proofErr w:type="spellEnd"/>
+      <w:r>
+        <w:t xml:space="preserve"> and displayed\n\nfeature-roomplan_q323 &amp; feature-</w:t>
+      </w:r>
+      <w:proofErr w:type="spellStart"/>
+      <w:r>
+        <w:t>saltoks_integration</w:t>
+      </w:r>
+      <w:proofErr w:type="spellEnd"/>
+      <w:r>
+        <w:t xml:space="preserve">\n\n### Acceptance </w:t>
+      </w:r>
+      <w:r>
+        <w:lastRenderedPageBreak/>
+        <w:t xml:space="preserve">Criteria\n\n- [ ] To-Do: Add Acceptance Criteria, follow these;\n\n**Parameter Scores (out of 20)**\n\n| Parameter | Description | Score (out of 20) |\n\n| --- | --- | --- |\n\n| Clarity | The story is clear but lacks detailed acceptance criteria. | 16 |\n\n| Completeness | Preconditions not clearly mentioned. | 12 |\n\n| Business Value Alignment | Strong relevance to patient experience and operational efficiency. | 18 |\n\n| Testability | Can be tested through user interface automation. | 15 |\n\n| Technical Feasibility | Practically implementable within typical healthcare system constraints. | 17 |\n\n**Overall Quality Score (out of </w:t>
+      </w:r>
+      <w:proofErr w:type="gramStart"/>
+      <w:r>
+        <w:t>100)*</w:t>
+      </w:r>
+      <w:proofErr w:type="gramEnd"/>
+      <w:r>
+        <w:t xml:space="preserve">*: 78 / 100\n\n**Improvement </w:t>
+      </w:r>
+      <w:proofErr w:type="gramStart"/>
+      <w:r>
+        <w:t>Areas:*</w:t>
+      </w:r>
+      <w:proofErr w:type="gramEnd"/>
+      <w:r>
+        <w:t xml:space="preserve">*\n\n1.  **Add explicit acceptance criteria**: Define clear and measurable criteria for the reservation notes display issue, including expected behavior and edge </w:t>
+      </w:r>
+      <w:proofErr w:type="gramStart"/>
+      <w:r>
+        <w:t>cases.\n\n2</w:t>
+      </w:r>
+      <w:proofErr w:type="gramEnd"/>
+      <w:r>
+        <w:t xml:space="preserve">.  **Specify preconditions**: Clearly mention the preconditions for the user story, such as the system configuration, user roles, and data </w:t>
+      </w:r>
+      <w:proofErr w:type="gramStart"/>
+      <w:r>
+        <w:t>requirements.\n\n3</w:t>
+      </w:r>
+      <w:proofErr w:type="gramEnd"/>
+      <w:r>
+        <w:t xml:space="preserve">.  **Enhance testability**: Provide more detailed information about the user interface elements and interactions that need to be </w:t>
+      </w:r>
+      <w:proofErr w:type="gramStart"/>
+      <w:r>
+        <w:t>tested.\n\n4</w:t>
+      </w:r>
+      <w:proofErr w:type="gramEnd"/>
+      <w:r>
+        <w:t>.  **Refine business value alignment**: Clarify how the reservation notes display issue affects patient experience, operational efficiency, or compliance.\n\n**Persona**\n\</w:t>
+      </w:r>
+      <w:proofErr w:type="spellStart"/>
+      <w:r>
+        <w:t>nAs</w:t>
+      </w:r>
+      <w:proofErr w:type="spellEnd"/>
+      <w:r>
+        <w:t xml:space="preserve"> a senior business analyst with 10+ years of experience in healthcare IT systems, I have reviewed this user story to ensure it meets the quality dimensions for clarity, completeness, business value alignment, testability, and technical feasibility.\n\n**Tone**\n\</w:t>
+      </w:r>
+      <w:proofErr w:type="spellStart"/>
+      <w:r>
+        <w:t>nThis</w:t>
+      </w:r>
+      <w:proofErr w:type="spellEnd"/>
+      <w:r>
+        <w:t xml:space="preserve"> review is professional, analytical, and constructive, providing actionable feedback to improve the user story for a healthcare project stakeholder meeting.",</w:t>
+      </w:r>
+    </w:p>
+    <w:p>
+      <w:r>
+        <w:t>                        "sender": "Machine",</w:t>
+      </w:r>
+    </w:p>
+    <w:p>
+      <w:r>
+        <w:t>                        "</w:t>
+      </w:r>
+      <w:proofErr w:type="spellStart"/>
+      <w:proofErr w:type="gramStart"/>
+      <w:r>
+        <w:t>sender</w:t>
+      </w:r>
+      <w:proofErr w:type="gramEnd"/>
+      <w:r>
+        <w:t>_name</w:t>
+      </w:r>
+      <w:proofErr w:type="spellEnd"/>
+      <w:r>
+        <w:t>": "AI",</w:t>
+      </w:r>
+    </w:p>
+    <w:p>
+      <w:r>
+        <w:t>                        "files": [],</w:t>
+      </w:r>
+    </w:p>
+    <w:p>
+      <w:r>
+        <w:t>                        "type": "object"</w:t>
+      </w:r>
+    </w:p>
+    <w:p>
+      <w:r>
+        <w:t>                    },</w:t>
+      </w:r>
+    </w:p>
+    <w:p>
+      <w:r>
+        <w:t>                    "outputs</w:t>
+      </w:r>
+      <w:proofErr w:type="gramStart"/>
+      <w:r>
+        <w:t>": {</w:t>
+      </w:r>
+      <w:proofErr w:type="gramEnd"/>
+    </w:p>
+    <w:p>
+      <w:r>
+        <w:t>                        "message</w:t>
+      </w:r>
+      <w:proofErr w:type="gramStart"/>
+      <w:r>
+        <w:t>": {</w:t>
+      </w:r>
+      <w:proofErr w:type="gramEnd"/>
+    </w:p>
+    <w:p>
+      <w:r>
+        <w:t>                            "message": "**User Story Review Summary**\n\n### User Story Title\</w:t>
+      </w:r>
+      <w:proofErr w:type="spellStart"/>
+      <w:r>
+        <w:t>nReservation</w:t>
+      </w:r>
+      <w:proofErr w:type="spellEnd"/>
+      <w:r>
+        <w:t xml:space="preserve"> notes display issue in guest detail pop over in room plan screen\n\n### Description\</w:t>
+      </w:r>
+      <w:proofErr w:type="spellStart"/>
+      <w:r>
+        <w:t>nReservation</w:t>
+      </w:r>
+      <w:proofErr w:type="spellEnd"/>
+      <w:r>
+        <w:t xml:space="preserve"> notes display issue in guest detail pop over in room plan screen\n1.click on guest in room plan screen\n2.click on notes tab in guest detail pop over\n3.click on edit option and add 3 different notes with 3 different categories\n4.Notice that reservation notes are not properly </w:t>
+      </w:r>
+      <w:proofErr w:type="spellStart"/>
+      <w:r>
+        <w:t>alligned</w:t>
+      </w:r>
+      <w:proofErr w:type="spellEnd"/>
+      <w:r>
+        <w:t xml:space="preserve"> and displayed\n\nfeature-roomplan_q323 &amp; feature-</w:t>
+      </w:r>
+      <w:proofErr w:type="spellStart"/>
+      <w:r>
+        <w:t>saltoks_integration</w:t>
+      </w:r>
+      <w:proofErr w:type="spellEnd"/>
+      <w:r>
+        <w:t xml:space="preserve">\n\n### Acceptance Criteria\n- [ ] To-Do: Add Acceptance </w:t>
+      </w:r>
+      <w:r>
+        <w:lastRenderedPageBreak/>
+        <w:t xml:space="preserve">Criteria, follow these;\n\n**Parameter Scores (out of 20)**\n\n| Parameter | Description | Score (out of 20) |\n| --- | --- | --- |\n| Clarity | The story is clear but lacks detailed acceptance criteria. | 16 |\n| Completeness | Preconditions not clearly mentioned. | 12 |\n| Business Value Alignment | Strong relevance to patient experience and operational efficiency. | 18 |\n| Testability | Can be tested through user interface automation. | 15 |\n| Technical Feasibility | Practically implementable within typical healthcare system constraints. | 17 |\n\n**Overall Quality Score (out of </w:t>
+      </w:r>
+      <w:proofErr w:type="gramStart"/>
+      <w:r>
+        <w:t>100)*</w:t>
+      </w:r>
+      <w:proofErr w:type="gramEnd"/>
+      <w:r>
+        <w:t xml:space="preserve">*: 78 / 100\n\n**Improvement </w:t>
+      </w:r>
+      <w:proofErr w:type="gramStart"/>
+      <w:r>
+        <w:t>Areas:*</w:t>
+      </w:r>
+      <w:proofErr w:type="gramEnd"/>
+      <w:r>
+        <w:t>*\n\n1.  **Add explicit acceptance criteria**: Define clear and measurable criteria for the reservation notes display issue, including expected behavior and edge cases.\n2.  **Specify preconditions**: Clearly mention the preconditions for the user story, such as the system configuration, user roles, and data requirements.\n3.  **Enhance testability**: Provide more detailed information about the user interface elements and interactions that need to be tested.\n4.  **Refine business value alignment**: Clarify how the reservation notes display issue affects patient experience, operational efficiency, or compliance.\n\n**Persona**\n\</w:t>
+      </w:r>
+      <w:proofErr w:type="spellStart"/>
+      <w:r>
+        <w:t>nAs</w:t>
+      </w:r>
+      <w:proofErr w:type="spellEnd"/>
+      <w:r>
+        <w:t xml:space="preserve"> a senior business analyst with 10+ years of experience in healthcare IT systems, I have reviewed this user story to ensure it meets the quality dimensions for clarity, completeness, business value alignment, testability, and technical feasibility.\n\n**Tone**\n\</w:t>
+      </w:r>
+      <w:proofErr w:type="spellStart"/>
+      <w:r>
+        <w:t>nThis</w:t>
+      </w:r>
+      <w:proofErr w:type="spellEnd"/>
+      <w:r>
+        <w:t xml:space="preserve"> review is professional, analytical, and constructive, providing actionable feedback to improve the user story for a healthcare project stakeholder meeting.",</w:t>
+      </w:r>
+    </w:p>
+    <w:p>
+      <w:r>
+        <w:t>                            "type": "text"</w:t>
+      </w:r>
+    </w:p>
+    <w:p>
+      <w:r>
+        <w:t>                        }</w:t>
+      </w:r>
+    </w:p>
+    <w:p>
+      <w:r>
+        <w:t>                    },</w:t>
+      </w:r>
+    </w:p>
+    <w:p>
+      <w:r>
+        <w:t>                    "logs</w:t>
+      </w:r>
+      <w:proofErr w:type="gramStart"/>
+      <w:r>
+        <w:t>": {</w:t>
+      </w:r>
+      <w:proofErr w:type="gramEnd"/>
+    </w:p>
+    <w:p>
+      <w:r>
+        <w:t>                        "message": []</w:t>
+      </w:r>
+    </w:p>
+    <w:p>
+      <w:r>
+        <w:t>                    },</w:t>
+      </w:r>
+    </w:p>
+    <w:p>
+      <w:r>
+        <w:t>                    "messages": [</w:t>
+      </w:r>
+    </w:p>
+    <w:p>
+      <w:r>
+        <w:t>                        {</w:t>
+      </w:r>
+    </w:p>
+    <w:p>
+      <w:r>
+        <w:t>                            "message": "**User Story Review Summary**\n\n### User Story Title\n\</w:t>
+      </w:r>
+      <w:proofErr w:type="spellStart"/>
+      <w:r>
+        <w:t>nReservation</w:t>
+      </w:r>
+      <w:proofErr w:type="spellEnd"/>
+      <w:r>
+        <w:t xml:space="preserve"> notes display issue in guest detail pop over in room plan screen\n\n### Description\n\</w:t>
+      </w:r>
+      <w:proofErr w:type="spellStart"/>
+      <w:r>
+        <w:t>nReservation</w:t>
+      </w:r>
+      <w:proofErr w:type="spellEnd"/>
+      <w:r>
+        <w:t xml:space="preserve"> notes display issue in guest detail pop over in room plan screen\n\n1.click on guest in room plan screen\n\n2.click on notes tab in guest detail pop over\n\n3.click on edit option and add 3 different notes with 3 different categories\n\n4.Notice that reservation notes are not properly </w:t>
+      </w:r>
+      <w:proofErr w:type="spellStart"/>
+      <w:r>
+        <w:t>alligned</w:t>
+      </w:r>
+      <w:proofErr w:type="spellEnd"/>
+      <w:r>
+        <w:t xml:space="preserve"> and </w:t>
+      </w:r>
+      <w:r>
+        <w:lastRenderedPageBreak/>
+        <w:t>displayed\n\nfeature-roomplan_q323 &amp; feature-</w:t>
+      </w:r>
+      <w:proofErr w:type="spellStart"/>
+      <w:r>
+        <w:t>saltoks_integration</w:t>
+      </w:r>
+      <w:proofErr w:type="spellEnd"/>
+      <w:r>
+        <w:t xml:space="preserve">\n\n### Acceptance Criteria\n\n- [ ] To-Do: Add Acceptance Criteria, follow these;\n\n**Parameter Scores (out of 20)**\n\n| Parameter | Description | Score (out of 20) |\n\n| --- | --- | --- |\n\n| Clarity | The story is clear but lacks detailed acceptance criteria. | 16 |\n\n| Completeness | Preconditions not clearly mentioned. | 12 |\n\n| Business Value Alignment | Strong relevance to patient experience and operational efficiency. | 18 |\n\n| Testability | Can be tested through user interface automation. | 15 |\n\n| Technical Feasibility | Practically implementable within typical healthcare system constraints. | 17 |\n\n**Overall Quality Score (out of </w:t>
+      </w:r>
+      <w:proofErr w:type="gramStart"/>
+      <w:r>
+        <w:t>100)*</w:t>
+      </w:r>
+      <w:proofErr w:type="gramEnd"/>
+      <w:r>
+        <w:t xml:space="preserve">*: 78 / 100\n\n**Improvement </w:t>
+      </w:r>
+      <w:proofErr w:type="gramStart"/>
+      <w:r>
+        <w:t>Areas:*</w:t>
+      </w:r>
+      <w:proofErr w:type="gramEnd"/>
+      <w:r>
+        <w:t xml:space="preserve">*\n\n1.  **Add explicit acceptance criteria**: Define clear and measurable criteria for the reservation notes display issue, including expected behavior and edge </w:t>
+      </w:r>
+      <w:proofErr w:type="gramStart"/>
+      <w:r>
+        <w:t>cases.\n\n2</w:t>
+      </w:r>
+      <w:proofErr w:type="gramEnd"/>
+      <w:r>
+        <w:t xml:space="preserve">.  **Specify preconditions**: Clearly mention the preconditions for the user story, such as the system configuration, user roles, and data </w:t>
+      </w:r>
+      <w:proofErr w:type="gramStart"/>
+      <w:r>
+        <w:t>requirements.\n\n3</w:t>
+      </w:r>
+      <w:proofErr w:type="gramEnd"/>
+      <w:r>
+        <w:t xml:space="preserve">.  **Enhance testability**: Provide more detailed information about the user interface elements and interactions that need to be </w:t>
+      </w:r>
+      <w:proofErr w:type="gramStart"/>
+      <w:r>
+        <w:t>tested.\n\n4</w:t>
+      </w:r>
+      <w:proofErr w:type="gramEnd"/>
+      <w:r>
+        <w:t>.  **Refine business value alignment**: Clarify how the reservation notes display issue affects patient experience, operational efficiency, or compliance.\n\n**Persona**\n\</w:t>
+      </w:r>
+      <w:proofErr w:type="spellStart"/>
+      <w:r>
+        <w:t>nAs</w:t>
+      </w:r>
+      <w:proofErr w:type="spellEnd"/>
+      <w:r>
+        <w:t xml:space="preserve"> a senior business analyst with 10+ years of experience in healthcare IT systems, I have reviewed this user story to ensure it meets the quality dimensions for clarity, completeness, business value alignment, testability, and technical feasibility.\n\n**Tone**\n\</w:t>
+      </w:r>
+      <w:proofErr w:type="spellStart"/>
+      <w:r>
+        <w:t>nThis</w:t>
+      </w:r>
+      <w:proofErr w:type="spellEnd"/>
+      <w:r>
+        <w:t xml:space="preserve"> review is professional, analytical, and constructive, providing actionable feedback to improve the user story for a healthcare project stakeholder meeting.",</w:t>
+      </w:r>
+    </w:p>
+    <w:p>
+      <w:r>
+        <w:t>                            "sender": "Machine",</w:t>
+      </w:r>
+    </w:p>
+    <w:p>
+      <w:r>
+        <w:t>                            "</w:t>
+      </w:r>
+      <w:proofErr w:type="spellStart"/>
+      <w:proofErr w:type="gramStart"/>
+      <w:r>
+        <w:t>sender</w:t>
+      </w:r>
+      <w:proofErr w:type="gramEnd"/>
+      <w:r>
+        <w:t>_name</w:t>
+      </w:r>
+      <w:proofErr w:type="spellEnd"/>
+      <w:r>
+        <w:t>": "AI",</w:t>
+      </w:r>
+    </w:p>
+    <w:p>
+      <w:r>
+        <w:t>                            "</w:t>
+      </w:r>
+      <w:proofErr w:type="spellStart"/>
+      <w:proofErr w:type="gramStart"/>
+      <w:r>
+        <w:t>session</w:t>
+      </w:r>
+      <w:proofErr w:type="gramEnd"/>
+      <w:r>
+        <w:t>_id</w:t>
+      </w:r>
+      <w:proofErr w:type="spellEnd"/>
+      <w:r>
+        <w:t>": "YOUR_SESSION_ID_HERE",</w:t>
+      </w:r>
+    </w:p>
+    <w:p>
+      <w:r>
+        <w:t>                            "</w:t>
+      </w:r>
+      <w:proofErr w:type="spellStart"/>
+      <w:proofErr w:type="gramStart"/>
+      <w:r>
+        <w:t>stream</w:t>
+      </w:r>
+      <w:proofErr w:type="gramEnd"/>
+      <w:r>
+        <w:t>_url</w:t>
+      </w:r>
+      <w:proofErr w:type="spellEnd"/>
+      <w:r>
+        <w:t xml:space="preserve">": </w:t>
+      </w:r>
+      <w:r>
+        <w:rPr>
+          <w:b/>
+          <w:bCs/>
+        </w:rPr>
+        <w:t>null</w:t>
+      </w:r>
+      <w:r>
+        <w:t>,</w:t>
+      </w:r>
+    </w:p>
+    <w:p>
+      <w:r>
+        <w:t>                            "</w:t>
+      </w:r>
+      <w:proofErr w:type="spellStart"/>
+      <w:proofErr w:type="gramStart"/>
+      <w:r>
+        <w:t>component</w:t>
+      </w:r>
+      <w:proofErr w:type="gramEnd"/>
+      <w:r>
+        <w:t>_id</w:t>
+      </w:r>
+      <w:proofErr w:type="spellEnd"/>
+      <w:r>
+        <w:t>": "</w:t>
+      </w:r>
+      <w:proofErr w:type="spellStart"/>
+      <w:r>
+        <w:t>ChatOutput-tQUbH</w:t>
+      </w:r>
+      <w:proofErr w:type="spellEnd"/>
+      <w:r>
+        <w:t>",</w:t>
+      </w:r>
+    </w:p>
+    <w:p>
+      <w:r>
+        <w:t>                            "files": [],</w:t>
+      </w:r>
+    </w:p>
+    <w:p>
+      <w:r>
+        <w:t>                            "type": "text"</w:t>
+      </w:r>
+    </w:p>
+    <w:p>
+      <w:r>
+        <w:t>                        }</w:t>
+      </w:r>
+    </w:p>
+    <w:p>
+      <w:r>
+        <w:t>                    ],</w:t>
+      </w:r>
+    </w:p>
+    <w:p>
+      <w:r>
+        <w:t>                    "</w:t>
+      </w:r>
+      <w:proofErr w:type="spellStart"/>
+      <w:r>
+        <w:t>timedelta</w:t>
+      </w:r>
+      <w:proofErr w:type="spellEnd"/>
+      <w:r>
+        <w:t xml:space="preserve">": </w:t>
+      </w:r>
+      <w:r>
+        <w:rPr>
+          <w:b/>
+          <w:bCs/>
+        </w:rPr>
+        <w:t>null</w:t>
+      </w:r>
+      <w:r>
+        <w:t>,</w:t>
+      </w:r>
+    </w:p>
+    <w:p>
+      <w:r>
+        <w:t xml:space="preserve">                    "duration": </w:t>
+      </w:r>
+      <w:r>
+        <w:rPr>
+          <w:b/>
+          <w:bCs/>
+        </w:rPr>
+        <w:t>null</w:t>
+      </w:r>
+      <w:r>
+        <w:t>,</w:t>
+      </w:r>
+    </w:p>
+    <w:p>
+      <w:r>
+        <w:lastRenderedPageBreak/>
+        <w:t>                    "</w:t>
+      </w:r>
+      <w:proofErr w:type="spellStart"/>
+      <w:proofErr w:type="gramStart"/>
+      <w:r>
+        <w:t>component</w:t>
+      </w:r>
+      <w:proofErr w:type="gramEnd"/>
+      <w:r>
+        <w:t>_display_name</w:t>
+      </w:r>
+      <w:proofErr w:type="spellEnd"/>
+      <w:r>
+        <w:t>": "Chat Output",</w:t>
+      </w:r>
+    </w:p>
+    <w:p>
+      <w:r>
+        <w:t>                    "</w:t>
+      </w:r>
+      <w:proofErr w:type="spellStart"/>
+      <w:proofErr w:type="gramStart"/>
+      <w:r>
+        <w:t>component</w:t>
+      </w:r>
+      <w:proofErr w:type="gramEnd"/>
+      <w:r>
+        <w:t>_id</w:t>
+      </w:r>
+      <w:proofErr w:type="spellEnd"/>
+      <w:r>
+        <w:t>": "</w:t>
+      </w:r>
+      <w:proofErr w:type="spellStart"/>
+      <w:r>
+        <w:t>ChatOutput-tQUbH</w:t>
+      </w:r>
+      <w:proofErr w:type="spellEnd"/>
+      <w:r>
+        <w:t>",</w:t>
+      </w:r>
+    </w:p>
+    <w:p>
+      <w:r>
+        <w:t>                    "</w:t>
+      </w:r>
+      <w:proofErr w:type="spellStart"/>
+      <w:proofErr w:type="gramStart"/>
+      <w:r>
+        <w:t>used</w:t>
+      </w:r>
+      <w:proofErr w:type="gramEnd"/>
+      <w:r>
+        <w:t>_frozen_result</w:t>
+      </w:r>
+      <w:proofErr w:type="spellEnd"/>
+      <w:r>
+        <w:t xml:space="preserve">": </w:t>
+      </w:r>
+      <w:r>
+        <w:rPr>
+          <w:b/>
+          <w:bCs/>
+        </w:rPr>
+        <w:t>false</w:t>
+      </w:r>
+      <w:r>
+        <w:t>,</w:t>
+      </w:r>
+    </w:p>
+    <w:p>
+      <w:r>
+        <w:t>                    "</w:t>
+      </w:r>
+      <w:proofErr w:type="spellStart"/>
+      <w:proofErr w:type="gramStart"/>
+      <w:r>
+        <w:t>token</w:t>
+      </w:r>
+      <w:proofErr w:type="gramEnd"/>
+      <w:r>
+        <w:t>_usage</w:t>
+      </w:r>
+      <w:proofErr w:type="spellEnd"/>
+      <w:r>
+        <w:t xml:space="preserve">": </w:t>
+      </w:r>
+      <w:r>
+        <w:rPr>
+          <w:b/>
+          <w:bCs/>
+        </w:rPr>
+        <w:t>null</w:t>
+      </w:r>
+    </w:p>
+    <w:p>
+      <w:r>
+        <w:t>                }</w:t>
+      </w:r>
+    </w:p>
+    <w:p>
+      <w:r>
+        <w:t>            ]</w:t>
+      </w:r>
+    </w:p>
+    <w:p>
+      <w:r>
+        <w:t>        }</w:t>
+      </w:r>
+    </w:p>
+    <w:p>
+      <w:r>
+        <w:t>    ]</w:t>
+      </w:r>
+    </w:p>
+    <w:p>
+      <w:r>
+        <w:t>}</w:t>
+      </w:r>
+    </w:p>
+    <w:p/>
     <w:sectPr>
       <w:pgSz w:w="12240" w:h="15840"/>
       <w:pgMar w:top="1440" w:right="1440" w:bottom="1440" w:left="1440" w:header="720" w:footer="720" w:gutter="0"/>

</xml_diff>